<commit_message>
Benchmark consistency: front door = Claude Sonnet 4.6 (GA), answer_model=harness:model, two Copilot Studio meters; app shows answer_model in detail+compare; blog/diagrams/banner + native docs updated
</commit_message>
<xml_diff>
--- a/docs/blog/benchmarking-blog-draft.docx
+++ b/docs/blog/benchmarking-blog-draft.docx
@@ -2,15 +2,7 @@
 <file path=word/document.xml><?xml version="1.0" encoding="utf-8"?>
 <w:document xmlns:w="http://schemas.openxmlformats.org/wordprocessingml/2006/main" xmlns:m="http://schemas.openxmlformats.org/officeDocument/2006/math" xmlns:r="http://schemas.openxmlformats.org/officeDocument/2006/relationships" xmlns:o="urn:schemas-microsoft-com:office:office" xmlns:v="urn:schemas-microsoft-com:vml" xmlns:w10="urn:schemas-microsoft-com:office:word" xmlns:a="http://schemas.openxmlformats.org/drawingml/2006/main" xmlns:pic="http://schemas.openxmlformats.org/drawingml/2006/picture" xmlns:wp="http://schemas.openxmlformats.org/drawingml/2006/wordprocessingDrawing">
   <w:body>
-    <w:p>
-      <w:pPr>
-        <w:pStyle w:val="Title"/>
-      </w:pPr>
-      <w:r>
-        <w:t xml:space="preserve">Benchmarking Retrieval Patterns for Copilot Studio and Foundry IQ</w:t>
-      </w:r>
-    </w:p>
-    <w:bookmarkStart w:id="45" w:name="X83d2b57cdfa7aa4b4b7f7c6383e5218702b2f46"/>
+    <w:bookmarkStart w:id="54" w:name="X83d2b57cdfa7aa4b4b7f7c6383e5218702b2f46"/>
     <w:p>
       <w:pPr>
         <w:pStyle w:val="Heading1"/>
@@ -57,84 +49,25 @@
     </w:p>
     <w:p>
       <w:pPr>
-        <w:pStyle w:val="BlockText"/>
-      </w:pPr>
-      <w:r>
-        <w:rPr>
-          <w:bCs/>
-          <w:b/>
-        </w:rPr>
-        <w:t xml:space="preserve">Reference implementation, not a production template.</w:t>
-      </w:r>
-      <w:r>
-        <w:t xml:space="preserve"> </w:t>
-      </w:r>
-      <w:r>
-        <w:t xml:space="preserve">The sample and numbers below are for learning and experimentation. Before you ship, review the</w:t>
-      </w:r>
-      <w:r>
-        <w:t xml:space="preserve"> </w:t>
-      </w:r>
-      <w:hyperlink r:id="rId21">
-        <w:r>
-          <w:rPr>
-            <w:rStyle w:val="Hyperlink"/>
-          </w:rPr>
-          <w:t xml:space="preserve">Azure Well-Architected Framework</w:t>
-        </w:r>
-      </w:hyperlink>
-      <w:r>
-        <w:t xml:space="preserve"> </w:t>
-      </w:r>
-      <w:r>
-        <w:t xml:space="preserve">for reliability, security, cost, and operations guidance.</w:t>
-      </w:r>
-    </w:p>
-    <w:p>
-      <w:r>
-        <w:pict>
-          <v:rect style="width:0;height:1.5pt" o:hralign="center" o:hrstd="t" o:hr="t"/>
-        </w:pict>
-      </w:r>
-    </w:p>
-    <w:bookmarkStart w:id="25" w:name="the-wrong-first-question"/>
-    <w:p>
-      <w:pPr>
-        <w:pStyle w:val="Heading2"/>
-      </w:pPr>
-      <w:r>
-        <w:t xml:space="preserve">The wrong first question</w:t>
-      </w:r>
-    </w:p>
-    <w:p>
-      <w:pPr>
-        <w:pStyle w:val="FirstParagraph"/>
-      </w:pPr>
-      <w:r>
-        <w:t xml:space="preserve">Part 1 gave you five ways to ground a Microsoft Copilot Studio agent in HR policy content: connect Copilot Studio straight to an Azure AI Search index (Pattern A), reach a Foundry IQ knowledge base through Microsoft IQ for agentic retrieval (Pattern A2), wrap the knowledge base in a Microsoft Foundry Agent Service prompt agent (Pattern B), route locator questions to a deterministic REST endpoint (Pattern C), or run the loop yourself in a Microsoft Agent Framework container (Hosted).</w:t>
-      </w:r>
-    </w:p>
-    <w:p>
-      <w:pPr>
         <w:pStyle w:val="BodyText"/>
       </w:pPr>
       <w:r>
         <w:drawing>
           <wp:inline>
-            <wp:extent cx="5334000" cy="4563747"/>
+            <wp:extent cx="5334000" cy="2667000"/>
             <wp:effectExtent b="0" l="0" r="0" t="0"/>
-            <wp:docPr descr="One Copilot Studio front door routes to five grounded-agent patterns: A (Azure AI Search), A2 (Foundry IQ agentic knowledge base), B (Foundry Agent Service), C (deterministic locator), and a self-hosted Agent Framework runtime." title="" id="23" name="Picture"/>
+            <wp:docPr descr="Benchmarking retrieval patterns for Copilot Studio and Foundry IQ — an evidence system, not a leaderboard. Part 2 of the series, summarizing three rules (measure the boundary, separate the cost lanes, gate on deterministic checks) across five patterns; front doors run Claude Sonnet 4.6 and backends synthesize on gpt-5-mini." title="" id="22" name="Picture"/>
             <a:graphic>
               <a:graphicData uri="http://schemas.openxmlformats.org/drawingml/2006/picture">
                 <pic:pic>
                   <pic:nvPicPr>
-                    <pic:cNvPr descr="../images/app/overview/architecture-map.gif" id="24" name="Picture"/>
+                    <pic:cNvPr descr="../images/banner-part2.png" id="23" name="Picture"/>
                     <pic:cNvPicPr>
                       <a:picLocks noChangeArrowheads="1" noChangeAspect="1"/>
                     </pic:cNvPicPr>
                   </pic:nvPicPr>
                   <pic:blipFill>
-                    <a:blip r:embed="rId22"/>
+                    <a:blip r:embed="rId21"/>
                     <a:stretch>
                       <a:fillRect/>
                     </a:stretch>
@@ -142,7 +75,7 @@
                   <pic:spPr bwMode="auto">
                     <a:xfrm>
                       <a:off x="0" y="0"/>
-                      <a:ext cx="5334000" cy="4563747"/>
+                      <a:ext cx="5334000" cy="2667000"/>
                     </a:xfrm>
                     <a:prstGeom prst="rect">
                       <a:avLst/>
@@ -163,6 +96,112 @@
     </w:p>
     <w:p>
       <w:pPr>
+        <w:pStyle w:val="BlockText"/>
+      </w:pPr>
+      <w:r>
+        <w:rPr>
+          <w:bCs/>
+          <w:b/>
+        </w:rPr>
+        <w:t xml:space="preserve">Reference implementation, not a production template.</w:t>
+      </w:r>
+      <w:r>
+        <w:t xml:space="preserve"> </w:t>
+      </w:r>
+      <w:r>
+        <w:t xml:space="preserve">The sample and numbers below are for learning and experimentation. Before you ship, review the</w:t>
+      </w:r>
+      <w:r>
+        <w:t xml:space="preserve"> </w:t>
+      </w:r>
+      <w:hyperlink r:id="rId24">
+        <w:r>
+          <w:rPr>
+            <w:rStyle w:val="Hyperlink"/>
+          </w:rPr>
+          <w:t xml:space="preserve">Azure Well-Architected Framework</w:t>
+        </w:r>
+      </w:hyperlink>
+      <w:r>
+        <w:t xml:space="preserve"> </w:t>
+      </w:r>
+      <w:r>
+        <w:t xml:space="preserve">for reliability, security, cost, and operations guidance.</w:t>
+      </w:r>
+    </w:p>
+    <w:p>
+      <w:r>
+        <w:pict>
+          <v:rect style="width:0;height:1.5pt" o:hralign="center" o:hrstd="t" o:hr="t"/>
+        </w:pict>
+      </w:r>
+    </w:p>
+    <w:bookmarkStart w:id="28" w:name="the-wrong-first-question"/>
+    <w:p>
+      <w:pPr>
+        <w:pStyle w:val="Heading2"/>
+      </w:pPr>
+      <w:r>
+        <w:t xml:space="preserve">The wrong first question</w:t>
+      </w:r>
+    </w:p>
+    <w:p>
+      <w:pPr>
+        <w:pStyle w:val="FirstParagraph"/>
+      </w:pPr>
+      <w:r>
+        <w:t xml:space="preserve">Part 1 gave you five ways to ground a Microsoft Copilot Studio agent in HR policy content: connect Copilot Studio straight to an Azure AI Search index (Pattern A), reach a Foundry IQ knowledge base through Microsoft IQ for agentic retrieval (Pattern A2), wrap the knowledge base in a Microsoft Foundry Agent Service prompt agent (Pattern B), route locator questions to a deterministic REST endpoint (Pattern C), or run the loop yourself in a Microsoft Agent Framework container (Hosted).</w:t>
+      </w:r>
+    </w:p>
+    <w:p>
+      <w:pPr>
+        <w:pStyle w:val="BodyText"/>
+      </w:pPr>
+      <w:r>
+        <w:drawing>
+          <wp:inline>
+            <wp:extent cx="5334000" cy="4313547"/>
+            <wp:effectExtent b="0" l="0" r="0" t="0"/>
+            <wp:docPr descr="One Copilot Studio front door routes to five grounded-agent patterns: A (Azure AI Search), A2 (Foundry IQ agentic knowledge base), B (Foundry Agent Service), C (deterministic locator), and a self-hosted Agent Framework runtime." title="" id="26" name="Picture"/>
+            <a:graphic>
+              <a:graphicData uri="http://schemas.openxmlformats.org/drawingml/2006/picture">
+                <pic:pic>
+                  <pic:nvPicPr>
+                    <pic:cNvPr descr="../images/app/overview/02-architecture-map.png" id="27" name="Picture"/>
+                    <pic:cNvPicPr>
+                      <a:picLocks noChangeArrowheads="1" noChangeAspect="1"/>
+                    </pic:cNvPicPr>
+                  </pic:nvPicPr>
+                  <pic:blipFill>
+                    <a:blip r:embed="rId25"/>
+                    <a:stretch>
+                      <a:fillRect/>
+                    </a:stretch>
+                  </pic:blipFill>
+                  <pic:spPr bwMode="auto">
+                    <a:xfrm>
+                      <a:off x="0" y="0"/>
+                      <a:ext cx="5334000" cy="4313547"/>
+                    </a:xfrm>
+                    <a:prstGeom prst="rect">
+                      <a:avLst/>
+                    </a:prstGeom>
+                    <a:noFill/>
+                    <a:ln w="9525">
+                      <a:noFill/>
+                      <a:headEnd/>
+                      <a:tailEnd/>
+                    </a:ln>
+                  </pic:spPr>
+                </pic:pic>
+              </a:graphicData>
+            </a:graphic>
+          </wp:inline>
+        </w:drawing>
+      </w:r>
+    </w:p>
+    <w:p>
+      <w:pPr>
         <w:pStyle w:val="BodyText"/>
       </w:pPr>
       <w:r>
@@ -217,8 +256,8 @@
         <w:t xml:space="preserve">that makes an architecture choice you can explain to a skeptical reviewer. Three rules, one normalized contract, a set of release gates, and a worked example you can run yourself. By the end you will know exactly which claims your data supports — and which ones it does not yet.</w:t>
       </w:r>
     </w:p>
-    <w:bookmarkEnd w:id="25"/>
-    <w:bookmarkStart w:id="26" w:name="Xa75d1150cf1580e11a9399fb8abcf657bee3763"/>
+    <w:bookmarkEnd w:id="28"/>
+    <w:bookmarkStart w:id="32" w:name="Xa75d1150cf1580e11a9399fb8abcf657bee3763"/>
     <w:p>
       <w:pPr>
         <w:pStyle w:val="Heading2"/>
@@ -469,6 +508,53 @@
         <w:pStyle w:val="BodyText"/>
       </w:pPr>
       <w:r>
+        <w:drawing>
+          <wp:inline>
+            <wp:extent cx="5334000" cy="2311400"/>
+            <wp:effectExtent b="0" l="0" r="0" t="0"/>
+            <wp:docPr descr="Three classes of evidence that do not mix: controlled experiments (which config is better, all else equal), load or capacity tests (behavior under N concurrent users), and production telemetry (what is actually happening in production) — each answers a different question and is never blended with the others." title="" id="30" name="Picture"/>
+            <a:graphic>
+              <a:graphicData uri="http://schemas.openxmlformats.org/drawingml/2006/picture">
+                <pic:pic>
+                  <pic:nvPicPr>
+                    <pic:cNvPr descr="diagrams/three-evidence-classes.png" id="31" name="Picture"/>
+                    <pic:cNvPicPr>
+                      <a:picLocks noChangeArrowheads="1" noChangeAspect="1"/>
+                    </pic:cNvPicPr>
+                  </pic:nvPicPr>
+                  <pic:blipFill>
+                    <a:blip r:embed="rId29"/>
+                    <a:stretch>
+                      <a:fillRect/>
+                    </a:stretch>
+                  </pic:blipFill>
+                  <pic:spPr bwMode="auto">
+                    <a:xfrm>
+                      <a:off x="0" y="0"/>
+                      <a:ext cx="5334000" cy="2311400"/>
+                    </a:xfrm>
+                    <a:prstGeom prst="rect">
+                      <a:avLst/>
+                    </a:prstGeom>
+                    <a:noFill/>
+                    <a:ln w="9525">
+                      <a:noFill/>
+                      <a:headEnd/>
+                      <a:tailEnd/>
+                    </a:ln>
+                  </pic:spPr>
+                </pic:pic>
+              </a:graphicData>
+            </a:graphic>
+          </wp:inline>
+        </w:drawing>
+      </w:r>
+    </w:p>
+    <w:p>
+      <w:pPr>
+        <w:pStyle w:val="BodyText"/>
+      </w:pPr>
+      <w:r>
         <w:t xml:space="preserve">A latency value is only "measured" when a committed result records its manifest, sample count, environment, and measurement boundary. Anything else — including the friendly</w:t>
       </w:r>
       <w:r>
@@ -502,8 +588,8 @@
         <w:t xml:space="preserve">labels from Part 1 — is an illustration, not a finding. Keeping these classes separate is not bureaucratic; it is what stops a load-test spike from masquerading as a typical response time.</w:t>
       </w:r>
     </w:p>
-    <w:bookmarkEnd w:id="26"/>
-    <w:bookmarkStart w:id="27" w:name="Xabc3dcc16cc0e3a7cd1fbb4efb474c37dd39713"/>
+    <w:bookmarkEnd w:id="32"/>
+    <w:bookmarkStart w:id="36" w:name="Xabc3dcc16cc0e3a7cd1fbb4efb474c37dd39713"/>
     <w:p>
       <w:pPr>
         <w:pStyle w:val="Heading2"/>
@@ -568,7 +654,20 @@
         <w:t xml:space="preserve"> </w:t>
       </w:r>
       <w:r>
-        <w:t xml:space="preserve">over Direct Line. The timer wraps one opaque span: send the question, await the final activity, stop. Everything Copilot Studio does inside — generative answer, knowledge call, REST tool, connected agent — is Microsoft-managed and not individually timed.</w:t>
+        <w:t xml:space="preserve">over Direct Line. The timer wraps one opaque span: send the question, await the final activity, stop. Everything Copilot Studio does inside — generative answer, knowledge call, REST tool, connected agent — is Microsoft-managed and not individually timed. All five front doors pin the same answer model,</w:t>
+      </w:r>
+      <w:r>
+        <w:t xml:space="preserve"> </w:t>
+      </w:r>
+      <w:r>
+        <w:rPr>
+          <w:bCs/>
+          <w:b/>
+        </w:rPr>
+        <w:t xml:space="preserve">Claude Sonnet 4.6</w:t>
+      </w:r>
+      <w:r>
+        <w:t xml:space="preserve">, so the front-door lanes differ only by harness and retrieval path, not model.</w:t>
       </w:r>
     </w:p>
     <w:p>
@@ -603,7 +702,25 @@
         <w:t xml:space="preserve">deployed-agent boundary</w:t>
       </w:r>
       <w:r>
-        <w:t xml:space="preserve">, because native evaluation cannot grade the external-agent hop from the outside.</w:t>
+        <w:t xml:space="preserve"> </w:t>
+      </w:r>
+      <w:r>
+        <w:t xml:space="preserve">— where the answer is synthesized on</w:t>
+      </w:r>
+      <w:r>
+        <w:t xml:space="preserve"> </w:t>
+      </w:r>
+      <w:r>
+        <w:rPr>
+          <w:rStyle w:val="VerbatimChar"/>
+        </w:rPr>
+        <w:t xml:space="preserve">gpt-5-mini</w:t>
+      </w:r>
+      <w:r>
+        <w:t xml:space="preserve"> </w:t>
+      </w:r>
+      <w:r>
+        <w:t xml:space="preserve">— because native evaluation cannot grade the external-agent hop from the outside.</w:t>
       </w:r>
     </w:p>
     <w:p>
@@ -632,133 +749,133 @@
     </w:p>
     <w:p>
       <w:pPr>
-        <w:pStyle w:val="SourceCode"/>
-      </w:pPr>
+        <w:pStyle w:val="BodyText"/>
+      </w:pPr>
+      <w:r>
+        <w:drawing>
+          <wp:inline>
+            <wp:extent cx="5334000" cy="2489200"/>
+            <wp:effectExtent b="0" l="0" r="0" t="0"/>
+            <wp:docPr descr="Measurement boundaries: patterns A, A2, and C are timed at the Copilot Studio front-door boundary over Direct Line — the timer wraps the opaque orchestration (generative answer on Claude Sonnet 4.6, knowledge call, REST tool, connected-agent call); patterns B and Hosted are timed at the deployed-agent boundary where the answer is synthesized on gpt-5-mini. Never subtract one boundary from another." title="" id="34" name="Picture"/>
+            <a:graphic>
+              <a:graphicData uri="http://schemas.openxmlformats.org/drawingml/2006/picture">
+                <pic:pic>
+                  <pic:nvPicPr>
+                    <pic:cNvPr descr="diagrams/measurement-boundaries.png" id="35" name="Picture"/>
+                    <pic:cNvPicPr>
+                      <a:picLocks noChangeArrowheads="1" noChangeAspect="1"/>
+                    </pic:cNvPicPr>
+                  </pic:nvPicPr>
+                  <pic:blipFill>
+                    <a:blip r:embed="rId33"/>
+                    <a:stretch>
+                      <a:fillRect/>
+                    </a:stretch>
+                  </pic:blipFill>
+                  <pic:spPr bwMode="auto">
+                    <a:xfrm>
+                      <a:off x="0" y="0"/>
+                      <a:ext cx="5334000" cy="2489200"/>
+                    </a:xfrm>
+                    <a:prstGeom prst="rect">
+                      <a:avLst/>
+                    </a:prstGeom>
+                    <a:noFill/>
+                    <a:ln w="9525">
+                      <a:noFill/>
+                      <a:headEnd/>
+                      <a:tailEnd/>
+                    </a:ln>
+                  </pic:spPr>
+                </pic:pic>
+              </a:graphicData>
+            </a:graphic>
+          </wp:inline>
+        </w:drawing>
+      </w:r>
+    </w:p>
+    <w:p>
+      <w:pPr>
+        <w:pStyle w:val="BodyText"/>
+      </w:pPr>
+      <w:r>
+        <w:t xml:space="preserve">The adapter records</w:t>
+      </w:r>
+      <w:r>
+        <w:t xml:space="preserve"> </w:t>
+      </w:r>
       <w:r>
         <w:rPr>
           <w:rStyle w:val="VerbatimChar"/>
         </w:rPr>
-        <w:t xml:space="preserve">client → Direct Line send → [ Copilot Studio orchestration (opaque) ] → final activity → client</w:t>
-      </w:r>
-      <w:r>
-        <w:br/>
+        <w:t xml:space="preserve">client_wall_time_ms</w:t>
+      </w:r>
+      <w:r>
+        <w:t xml:space="preserve"> </w:t>
+      </w:r>
+      <w:r>
+        <w:t xml:space="preserve">as</w:t>
+      </w:r>
+      <w:r>
+        <w:t xml:space="preserve"> </w:t>
       </w:r>
       <w:r>
         <w:rPr>
           <w:rStyle w:val="VerbatimChar"/>
         </w:rPr>
-        <w:t xml:space="preserve">                                   ├─ generative answer (model)</w:t>
-      </w:r>
-      <w:r>
-        <w:br/>
+        <w:t xml:space="preserve">measured</w:t>
+      </w:r>
+      <w:r>
+        <w:t xml:space="preserve"> </w:t>
+      </w:r>
+      <w:r>
+        <w:t xml:space="preserve">and</w:t>
+      </w:r>
+      <w:r>
+        <w:t xml:space="preserve"> </w:t>
       </w:r>
       <w:r>
         <w:rPr>
           <w:rStyle w:val="VerbatimChar"/>
         </w:rPr>
-        <w:t xml:space="preserve">                                   ├─ knowledge call (Azure AI Search / Foundry IQ)</w:t>
-      </w:r>
-      <w:r>
-        <w:br/>
+        <w:t xml:space="preserve">service_elapsed_time_ms</w:t>
+      </w:r>
+      <w:r>
+        <w:t xml:space="preserve"> </w:t>
+      </w:r>
+      <w:r>
+        <w:t xml:space="preserve">as</w:t>
+      </w:r>
+      <w:r>
+        <w:t xml:space="preserve"> </w:t>
       </w:r>
       <w:r>
         <w:rPr>
           <w:rStyle w:val="VerbatimChar"/>
         </w:rPr>
-        <w:t xml:space="preserve">                                   ├─ tool call (REST /api/lookup)</w:t>
-      </w:r>
-      <w:r>
-        <w:br/>
+        <w:t xml:space="preserve">unavailable</w:t>
+      </w:r>
+      <w:r>
+        <w:t xml:space="preserve"> </w:t>
+      </w:r>
+      <w:r>
+        <w:t xml:space="preserve">with reason</w:t>
+      </w:r>
+      <w:r>
+        <w:t xml:space="preserve"> </w:t>
       </w:r>
       <w:r>
         <w:rPr>
           <w:rStyle w:val="VerbatimChar"/>
         </w:rPr>
-        <w:t xml:space="preserve">                                   └─ connected-agent call (Foundry external agent)</w:t>
-      </w:r>
-    </w:p>
-    <w:p>
-      <w:pPr>
-        <w:pStyle w:val="FirstParagraph"/>
-      </w:pPr>
-      <w:r>
-        <w:t xml:space="preserve">The adapter records</w:t>
-      </w:r>
-      <w:r>
-        <w:t xml:space="preserve"> </w:t>
-      </w:r>
-      <w:r>
-        <w:rPr>
-          <w:rStyle w:val="VerbatimChar"/>
-        </w:rPr>
-        <w:t xml:space="preserve">client_wall_time_ms</w:t>
-      </w:r>
-      <w:r>
-        <w:t xml:space="preserve"> </w:t>
-      </w:r>
-      <w:r>
-        <w:t xml:space="preserve">as</w:t>
-      </w:r>
-      <w:r>
-        <w:t xml:space="preserve"> </w:t>
-      </w:r>
-      <w:r>
-        <w:rPr>
-          <w:rStyle w:val="VerbatimChar"/>
-        </w:rPr>
-        <w:t xml:space="preserve">measured</w:t>
-      </w:r>
-      <w:r>
-        <w:t xml:space="preserve"> </w:t>
-      </w:r>
-      <w:r>
-        <w:t xml:space="preserve">and</w:t>
-      </w:r>
-      <w:r>
-        <w:t xml:space="preserve"> </w:t>
-      </w:r>
-      <w:r>
-        <w:rPr>
-          <w:rStyle w:val="VerbatimChar"/>
-        </w:rPr>
-        <w:t xml:space="preserve">service_elapsed_time_ms</w:t>
-      </w:r>
-      <w:r>
-        <w:t xml:space="preserve"> </w:t>
-      </w:r>
-      <w:r>
-        <w:t xml:space="preserve">as</w:t>
-      </w:r>
-      <w:r>
-        <w:t xml:space="preserve"> </w:t>
-      </w:r>
-      <w:r>
-        <w:rPr>
-          <w:rStyle w:val="VerbatimChar"/>
-        </w:rPr>
-        <w:t xml:space="preserve">unavailable</w:t>
-      </w:r>
-      <w:r>
-        <w:t xml:space="preserve"> </w:t>
-      </w:r>
-      <w:r>
-        <w:t xml:space="preserve">with reason</w:t>
-      </w:r>
-      <w:r>
-        <w:t xml:space="preserve"> </w:t>
-      </w:r>
-      <w:r>
-        <w:rPr>
-          <w:rStyle w:val="VerbatimChar"/>
-        </w:rPr>
         <w:t xml:space="preserve">NOT_EXPOSED</w:t>
       </w:r>
       <w:r>
         <w:t xml:space="preserve">. Missing is recorded as missing — never as zero.</w:t>
       </w:r>
     </w:p>
-    <w:bookmarkEnd w:id="27"/>
-    <w:bookmarkStart w:id="28" w:name="rule-2-two-cost-lanes-that-never-add-up"/>
+    <w:bookmarkEnd w:id="36"/>
+    <w:bookmarkStart w:id="37" w:name="rule-2-two-cost-lanes-that-never-add-up"/>
     <w:p>
       <w:pPr>
         <w:pStyle w:val="Heading2"/>
@@ -908,7 +1025,7 @@
                 <w:bCs/>
                 <w:b/>
               </w:rPr>
-              <w:t xml:space="preserve">Copilot Studio Credits</w:t>
+              <w:t xml:space="preserve">Copilot Studio (Credits / messages)</w:t>
             </w:r>
           </w:p>
         </w:tc>
@@ -932,7 +1049,7 @@
               <w:jc w:val="left"/>
             </w:pPr>
             <w:r>
-              <w:t xml:space="preserve">Per-message Copilot Studio Credits</w:t>
+              <w:t xml:space="preserve">Per-message Copilot Studio billing — standard-harness messages (A, C, B/Hosted) and GitHub Copilot-harness Credits (A2)</w:t>
             </w:r>
           </w:p>
         </w:tc>
@@ -1005,8 +1122,160 @@
         <w:t xml:space="preserve">to Copilot Studio Credits — two lanes, stated separately.</w:t>
       </w:r>
     </w:p>
-    <w:bookmarkEnd w:id="28"/>
-    <w:bookmarkStart w:id="29" w:name="X6591136b2466d9f485a7eb4fc08b005b06f44d6"/>
+    <w:p>
+      <w:pPr>
+        <w:pStyle w:val="BodyText"/>
+      </w:pPr>
+      <w:r>
+        <w:t xml:space="preserve">One more reason the Credits lane can't be token-priced: in Copilot Studio the</w:t>
+      </w:r>
+      <w:r>
+        <w:t xml:space="preserve"> </w:t>
+      </w:r>
+      <w:r>
+        <w:rPr>
+          <w:bCs/>
+          <w:b/>
+        </w:rPr>
+        <w:t xml:space="preserve">harness</w:t>
+      </w:r>
+      <w:r>
+        <w:t xml:space="preserve"> </w:t>
+      </w:r>
+      <w:r>
+        <w:t xml:space="preserve">is the runtime and the</w:t>
+      </w:r>
+      <w:r>
+        <w:t xml:space="preserve"> </w:t>
+      </w:r>
+      <w:r>
+        <w:rPr>
+          <w:bCs/>
+          <w:b/>
+        </w:rPr>
+        <w:t xml:space="preserve">model</w:t>
+      </w:r>
+      <w:r>
+        <w:t xml:space="preserve"> </w:t>
+      </w:r>
+      <w:r>
+        <w:t xml:space="preserve">is a separate selectable engine. Patterns A, C, and the B/Hosted front doors run on the</w:t>
+      </w:r>
+      <w:r>
+        <w:t xml:space="preserve"> </w:t>
+      </w:r>
+      <w:r>
+        <w:rPr>
+          <w:bCs/>
+          <w:b/>
+        </w:rPr>
+        <w:t xml:space="preserve">standard harness</w:t>
+      </w:r>
+      <w:r>
+        <w:t xml:space="preserve">; Pattern A2 runs on the</w:t>
+      </w:r>
+      <w:r>
+        <w:t xml:space="preserve"> </w:t>
+      </w:r>
+      <w:r>
+        <w:rPr>
+          <w:bCs/>
+          <w:b/>
+        </w:rPr>
+        <w:t xml:space="preserve">GitHub Copilot harness</w:t>
+      </w:r>
+      <w:r>
+        <w:t xml:space="preserve">. The model is now selectable and disclosed — this project pins</w:t>
+      </w:r>
+      <w:r>
+        <w:t xml:space="preserve"> </w:t>
+      </w:r>
+      <w:r>
+        <w:rPr>
+          <w:bCs/>
+          <w:b/>
+        </w:rPr>
+        <w:t xml:space="preserve">Claude Sonnet 4.6</w:t>
+      </w:r>
+      <w:r>
+        <w:t xml:space="preserve"> </w:t>
+      </w:r>
+      <w:r>
+        <w:t xml:space="preserve">on all five front doors for parity — so we record</w:t>
+      </w:r>
+      <w:r>
+        <w:t xml:space="preserve"> </w:t>
+      </w:r>
+      <w:r>
+        <w:rPr>
+          <w:rStyle w:val="VerbatimChar"/>
+        </w:rPr>
+        <w:t xml:space="preserve">answer_model</w:t>
+      </w:r>
+      <w:r>
+        <w:t xml:space="preserve"> </w:t>
+      </w:r>
+      <w:r>
+        <w:t xml:space="preserve">as</w:t>
+      </w:r>
+      <w:r>
+        <w:t xml:space="preserve"> </w:t>
+      </w:r>
+      <w:r>
+        <w:rPr>
+          <w:rStyle w:val="VerbatimChar"/>
+        </w:rPr>
+        <w:t xml:space="preserve">&lt;harness&gt;:&lt;model&gt;</w:t>
+      </w:r>
+      <w:r>
+        <w:t xml:space="preserve"> </w:t>
+      </w:r>
+      <w:r>
+        <w:t xml:space="preserve">(</w:t>
+      </w:r>
+      <w:r>
+        <w:rPr>
+          <w:rStyle w:val="VerbatimChar"/>
+        </w:rPr>
+        <w:t xml:space="preserve">microsoft_managed_standard_harness:claude-sonnet-4.6</w:t>
+      </w:r>
+      <w:r>
+        <w:t xml:space="preserve"> </w:t>
+      </w:r>
+      <w:r>
+        <w:t xml:space="preserve">or</w:t>
+      </w:r>
+      <w:r>
+        <w:t xml:space="preserve"> </w:t>
+      </w:r>
+      <w:r>
+        <w:rPr>
+          <w:rStyle w:val="VerbatimChar"/>
+        </w:rPr>
+        <w:t xml:space="preserve">github_copilot_harness:claude-sonnet-4.6</w:t>
+      </w:r>
+      <w:r>
+        <w:t xml:space="preserve">). It still can't join the per-token axis: the standard harness bills as per-message Copilot Studio messages and the GitHub Copilot harness bills in Copilot Credits — two Copilot Studio meters, neither token-metered. We compare quality</w:t>
+      </w:r>
+      <w:r>
+        <w:t xml:space="preserve"> </w:t>
+      </w:r>
+      <w:r>
+        <w:rPr>
+          <w:iCs/>
+          <w:i/>
+        </w:rPr>
+        <w:t xml:space="preserve">within</w:t>
+      </w:r>
+      <w:r>
+        <w:t xml:space="preserve"> </w:t>
+      </w:r>
+      <w:r>
+        <w:t xml:space="preserve">a platform first, because the harness (and any model change) is a confound across them.</w:t>
+      </w:r>
+    </w:p>
+    <w:bookmarkEnd w:id="37"/>
+    <w:bookmarkStart w:id="38" w:name="X6591136b2466d9f485a7eb4fc08b005b06f44d6"/>
     <w:p>
       <w:pPr>
         <w:pStyle w:val="Heading2"/>
@@ -1243,8 +1512,8 @@
         <w:t xml:space="preserve">When a judge disagrees with the gold set, the gold set wins. That single rule keeps a chatty model from grading its own homework.</w:t>
       </w:r>
     </w:p>
-    <w:bookmarkEnd w:id="29"/>
-    <w:bookmarkStart w:id="33" w:name="one-contract-to-make-runs-comparable"/>
+    <w:bookmarkEnd w:id="38"/>
+    <w:bookmarkStart w:id="42" w:name="one-contract-to-make-runs-comparable"/>
     <w:p>
       <w:pPr>
         <w:pStyle w:val="Heading2"/>
@@ -1437,18 +1706,18 @@
           <wp:inline>
             <wp:extent cx="5334000" cy="4577238"/>
             <wp:effectExtent b="0" l="0" r="0" t="0"/>
-            <wp:docPr descr="Compare view that refuses to rank two runs when their dataset, corpus, index, model, or measurement boundary differ." title="" id="31" name="Picture"/>
+            <wp:docPr descr="Compare view that refuses to rank two runs when their dataset, corpus, index, model, or measurement boundary differ." title="" id="40" name="Picture"/>
             <a:graphic>
               <a:graphicData uri="http://schemas.openxmlformats.org/drawingml/2006/picture">
                 <pic:pic>
                   <pic:nvPicPr>
-                    <pic:cNvPr descr="../images/app/04-compare.png" id="32" name="Picture"/>
+                    <pic:cNvPr descr="../images/app/04-compare.png" id="41" name="Picture"/>
                     <pic:cNvPicPr>
                       <a:picLocks noChangeArrowheads="1" noChangeAspect="1"/>
                     </pic:cNvPicPr>
                   </pic:nvPicPr>
                   <pic:blipFill>
-                    <a:blip r:embed="rId30"/>
+                    <a:blip r:embed="rId39"/>
                     <a:stretch>
                       <a:fillRect/>
                     </a:stretch>
@@ -1628,8 +1897,8 @@
         <w:t xml:space="preserve">Fixture wall-times are contract checks, not Azure performance evidence — and the reports label them that way.</w:t>
       </w:r>
     </w:p>
-    <w:bookmarkEnd w:id="33"/>
-    <w:bookmarkStart w:id="34" w:name="X7d25f1c48a6af2ca02b11eddf9ed34200321a14"/>
+    <w:bookmarkEnd w:id="42"/>
+    <w:bookmarkStart w:id="43" w:name="X7d25f1c48a6af2ca02b11eddf9ed34200321a14"/>
     <w:p>
       <w:pPr>
         <w:pStyle w:val="Heading2"/>
@@ -2116,11 +2385,39 @@
         <w:pStyle w:val="FirstParagraph"/>
       </w:pPr>
       <w:r>
-        <w:t xml:space="preserve">The same bundle measures the other four patterns too — but at different boundaries, which is exactly why Rule 1 keeps them off the chart above. Patterns A, A2, and C were run through the Copilot Studio front door over Direct Line (native-evaluation quality of 85.7%, 85.7%, and 71.4% on the seven-case set); Pattern B and the deployed Hosted runtime were measured at the deployed-agent boundary (71.4% each). Where a lane is genuinely incomplete — front-door A2 latency, isolated load, billed-cost reconciliation — the workbench shows it as unavailable, not zero.</w:t>
-      </w:r>
-    </w:p>
-    <w:bookmarkEnd w:id="34"/>
-    <w:bookmarkStart w:id="38" w:name="release-gates-not-vibes"/>
+        <w:t xml:space="preserve">The same bundle measures the other four patterns too — but at different boundaries, which is exactly why Rule 1 keeps them off the chart above. Patterns A, A2, and C were run through the Copilot Studio front door over Direct Line (native-evaluation quality of 85.7%, 85.7%, and 71.4% on the seven-case set — all three front doors pinned to the same model,</w:t>
+      </w:r>
+      <w:r>
+        <w:t xml:space="preserve"> </w:t>
+      </w:r>
+      <w:r>
+        <w:rPr>
+          <w:bCs/>
+          <w:b/>
+        </w:rPr>
+        <w:t xml:space="preserve">Claude Sonnet 4.6</w:t>
+      </w:r>
+      <w:r>
+        <w:t xml:space="preserve">, so the remaining difference is the harness: A and C on the standard harness, A2 on the GitHub Copilot harness); Pattern B and the deployed Hosted runtime were measured at the deployed-agent boundary on</w:t>
+      </w:r>
+      <w:r>
+        <w:t xml:space="preserve"> </w:t>
+      </w:r>
+      <w:r>
+        <w:rPr>
+          <w:rStyle w:val="VerbatimChar"/>
+        </w:rPr>
+        <w:t xml:space="preserve">gpt-5-mini</w:t>
+      </w:r>
+      <w:r>
+        <w:t xml:space="preserve"> </w:t>
+      </w:r>
+      <w:r>
+        <w:t xml:space="preserve">(71.4% each), because native front-door evaluation returns an error across the external-agent hop. Where a lane is genuinely incomplete — front-door A2 latency, isolated load, billed-cost reconciliation — the workbench shows it as unavailable, not zero.</w:t>
+      </w:r>
+    </w:p>
+    <w:bookmarkEnd w:id="43"/>
+    <w:bookmarkStart w:id="47" w:name="release-gates-not-vibes"/>
     <w:p>
       <w:pPr>
         <w:pStyle w:val="Heading2"/>
@@ -2357,18 +2654,18 @@
           <wp:inline>
             <wp:extent cx="5334000" cy="4497228"/>
             <wp:effectExtent b="0" l="0" r="0" t="0"/>
-            <wp:docPr descr="Pareto and SLO qualification view listing gate thresholds and which runs pass or are blocked." title="" id="36" name="Picture"/>
+            <wp:docPr descr="Pareto and SLO qualification view listing gate thresholds and which runs pass or are blocked." title="" id="45" name="Picture"/>
             <a:graphic>
               <a:graphicData uri="http://schemas.openxmlformats.org/drawingml/2006/picture">
                 <pic:pic>
                   <pic:nvPicPr>
-                    <pic:cNvPr descr="../images/app/05-pareto-slo.png" id="37" name="Picture"/>
+                    <pic:cNvPr descr="../images/app/05-pareto-slo.png" id="46" name="Picture"/>
                     <pic:cNvPicPr>
                       <a:picLocks noChangeArrowheads="1" noChangeAspect="1"/>
                     </pic:cNvPicPr>
                   </pic:nvPicPr>
                   <pic:blipFill>
-                    <a:blip r:embed="rId35"/>
+                    <a:blip r:embed="rId44"/>
                     <a:stretch>
                       <a:fillRect/>
                     </a:stretch>
@@ -2395,8 +2692,8 @@
         </w:drawing>
       </w:r>
     </w:p>
-    <w:bookmarkEnd w:id="38"/>
-    <w:bookmarkStart w:id="39" w:name="Xbee21aa572a96596380dc16f969c5e90fdc639e"/>
+    <w:bookmarkEnd w:id="47"/>
+    <w:bookmarkStart w:id="48" w:name="Xbee21aa572a96596380dc16f969c5e90fdc639e"/>
     <w:p>
       <w:pPr>
         <w:pStyle w:val="Heading2"/>
@@ -2465,8 +2762,8 @@
         <w:t xml:space="preserve">The workbench normalizes just enough to make a cross-product decision, then deep-links out to those systems for root-cause work. It does not copy their detail views or pretend to be a trace explorer.</w:t>
       </w:r>
     </w:p>
-    <w:bookmarkEnd w:id="39"/>
-    <w:bookmarkStart w:id="40" w:name="what-this-does-not-claim-yet"/>
+    <w:bookmarkEnd w:id="48"/>
+    <w:bookmarkStart w:id="49" w:name="what-this-does-not-claim-yet"/>
     <w:p>
       <w:pPr>
         <w:pStyle w:val="Heading2"/>
@@ -2527,8 +2824,8 @@
         <w:t xml:space="preserve">None of these are fudged into the charts. Missing stays missing.</w:t>
       </w:r>
     </w:p>
-    <w:bookmarkEnd w:id="40"/>
-    <w:bookmarkStart w:id="44" w:name="try-it-yourself"/>
+    <w:bookmarkEnd w:id="49"/>
+    <w:bookmarkStart w:id="53" w:name="try-it-yourself"/>
     <w:p>
       <w:pPr>
         <w:pStyle w:val="Heading2"/>
@@ -2652,7 +2949,7 @@
       <w:r>
         <w:t xml:space="preserve"> </w:t>
       </w:r>
-      <w:hyperlink r:id="rId41">
+      <w:hyperlink r:id="rId50">
         <w:r>
           <w:rPr>
             <w:rStyle w:val="Hyperlink"/>
@@ -2666,7 +2963,7 @@
       <w:r>
         <w:t xml:space="preserve"> </w:t>
       </w:r>
-      <w:hyperlink r:id="rId42">
+      <w:hyperlink r:id="rId51">
         <w:r>
           <w:rPr>
             <w:rStyle w:val="Hyperlink"/>
@@ -2680,7 +2977,7 @@
       <w:r>
         <w:t xml:space="preserve"> </w:t>
       </w:r>
-      <w:hyperlink r:id="rId43">
+      <w:hyperlink r:id="rId52">
         <w:r>
           <w:rPr>
             <w:rStyle w:val="Hyperlink"/>
@@ -2712,8 +3009,8 @@
         <w:t xml:space="preserve">Ask HR is a development and learning sample. Production deployments should add authentication, monitoring, data governance, content safety, and compliance controls appropriate to your organization.</w:t>
       </w:r>
     </w:p>
-    <w:bookmarkEnd w:id="44"/>
-    <w:bookmarkEnd w:id="45"/>
+    <w:bookmarkEnd w:id="53"/>
+    <w:bookmarkEnd w:id="54"/>
     <w:sectPr/>
   </w:body>
 </w:document>

</xml_diff>